<commit_message>
adding updates to model_equations_review and some more downloaded resources in /docs/research_papers
</commit_message>
<xml_diff>
--- a/docs/model_equations_review.docx
+++ b/docs/model_equations_review.docx
@@ -1147,6 +1147,1025 @@
       </w:tr>
     </w:tbl>
     <w:p/>
+    <w:p>
+      <w:r>
+        <w:br w:type="page"/>
+      </w:r>
+    </w:p>
+    <w:p>
+      <w:pPr>
+        <w:pStyle w:val="Heading1"/>
+      </w:pPr>
+      <w:r>
+        <w:t>Follow-up Questions</w:t>
+      </w:r>
+    </w:p>
+    <w:p/>
+    <w:p>
+      <w:pPr>
+        <w:pStyle w:val="Heading2"/>
+      </w:pPr>
+      <w:r>
+        <w:t>FQ1 — Can each tract x income group be its own consumer? (16 x 3 = 48 types)</w:t>
+      </w:r>
+    </w:p>
+    <w:p>
+      <w:r>
+        <w:t>Yes — this is exactly the LEVEL_2 approach, and it is strictly better than either pure option alone. Each of the 48 (tract, income group) combinations becomes its own consumer type i, with its own location centroid, household count n_i, and beta values. The number of (i, j) pairs becomes 48 x J.</w:t>
+      </w:r>
+    </w:p>
+    <w:p>
+      <w:pPr>
+        <w:pStyle w:val="Heading3"/>
+      </w:pPr>
+      <w:r>
+        <w:t>What needs to change in the model</w:t>
+      </w:r>
+    </w:p>
+    <w:tbl>
+      <w:tblPr>
+        <w:tblStyle w:val="LightGrid-Accent1"/>
+        <w:tblW w:type="auto" w:w="0"/>
+        <w:tblLook w:firstColumn="1" w:firstRow="1" w:lastColumn="0" w:lastRow="0" w:noHBand="0" w:noVBand="1" w:val="04A0"/>
+      </w:tblPr>
+      <w:tblGrid>
+        <w:gridCol w:w="3024"/>
+        <w:gridCol w:w="3024"/>
+        <w:gridCol w:w="3024"/>
+      </w:tblGrid>
+      <w:tr>
+        <w:tc>
+          <w:tcPr>
+            <w:tcW w:type="dxa" w:w="3024"/>
+          </w:tcPr>
+          <w:p>
+            <w:r>
+              <w:rPr>
+                <w:b/>
+              </w:rPr>
+              <w:t>Element</w:t>
+            </w:r>
+          </w:p>
+        </w:tc>
+        <w:tc>
+          <w:tcPr>
+            <w:tcW w:type="dxa" w:w="3024"/>
+          </w:tcPr>
+          <w:p>
+            <w:r>
+              <w:rPr>
+                <w:b/>
+              </w:rPr>
+              <w:t>Current LEVEL_1 (3 groups)</w:t>
+            </w:r>
+          </w:p>
+        </w:tc>
+        <w:tc>
+          <w:tcPr>
+            <w:tcW w:type="dxa" w:w="3024"/>
+          </w:tcPr>
+          <w:p>
+            <w:r>
+              <w:rPr>
+                <w:b/>
+              </w:rPr>
+              <w:t>16 x 3 = 48 consumer types</w:t>
+            </w:r>
+          </w:p>
+        </w:tc>
+      </w:tr>
+      <w:tr>
+        <w:tc>
+          <w:tcPr>
+            <w:tcW w:type="dxa" w:w="3024"/>
+          </w:tcPr>
+          <w:p>
+            <w:r>
+              <w:t>Consumer index i</w:t>
+            </w:r>
+          </w:p>
+        </w:tc>
+        <w:tc>
+          <w:tcPr>
+            <w:tcW w:type="dxa" w:w="3024"/>
+          </w:tcPr>
+          <w:p>
+            <w:r>
+              <w:t>3 income groups (CD2-wide)</w:t>
+            </w:r>
+          </w:p>
+        </w:tc>
+        <w:tc>
+          <w:tcPr>
+            <w:tcW w:type="dxa" w:w="3024"/>
+          </w:tcPr>
+          <w:p>
+            <w:r>
+              <w:t>48 (tract, income group) pairs</w:t>
+            </w:r>
+          </w:p>
+        </w:tc>
+      </w:tr>
+      <w:tr>
+        <w:tc>
+          <w:tcPr>
+            <w:tcW w:type="dxa" w:w="3024"/>
+          </w:tcPr>
+          <w:p>
+            <w:r>
+              <w:t>n_i</w:t>
+            </w:r>
+          </w:p>
+        </w:tc>
+        <w:tc>
+          <w:tcPr>
+            <w:tcW w:type="dxa" w:w="3024"/>
+          </w:tcPr>
+          <w:p>
+            <w:r>
+              <w:t>CD2-total HH per income group</w:t>
+            </w:r>
+          </w:p>
+        </w:tc>
+        <w:tc>
+          <w:tcPr>
+            <w:tcW w:type="dxa" w:w="3024"/>
+          </w:tcPr>
+          <w:p>
+            <w:r>
+              <w:t>HH per income bracket per tract (ACS B19001 by tract)</w:t>
+            </w:r>
+          </w:p>
+        </w:tc>
+      </w:tr>
+      <w:tr>
+        <w:tc>
+          <w:tcPr>
+            <w:tcW w:type="dxa" w:w="3024"/>
+          </w:tcPr>
+          <w:p>
+            <w:r>
+              <w:t>d_ij</w:t>
+            </w:r>
+          </w:p>
+        </w:tc>
+        <w:tc>
+          <w:tcPr>
+            <w:tcW w:type="dxa" w:w="3024"/>
+          </w:tcPr>
+          <w:p>
+            <w:r>
+              <w:t>CD2 centroid to store j</w:t>
+            </w:r>
+          </w:p>
+        </w:tc>
+        <w:tc>
+          <w:tcPr>
+            <w:tcW w:type="dxa" w:w="3024"/>
+          </w:tcPr>
+          <w:p>
+            <w:r>
+              <w:t>Each tract centroid to store j (more spatially accurate)</w:t>
+            </w:r>
+          </w:p>
+        </w:tc>
+      </w:tr>
+      <w:tr>
+        <w:tc>
+          <w:tcPr>
+            <w:tcW w:type="dxa" w:w="3024"/>
+          </w:tcPr>
+          <w:p>
+            <w:r>
+              <w:t>beta_p_i, beta_d_i</w:t>
+            </w:r>
+          </w:p>
+        </w:tc>
+        <w:tc>
+          <w:tcPr>
+            <w:tcW w:type="dxa" w:w="3024"/>
+          </w:tcPr>
+          <w:p>
+            <w:r>
+              <w:t>One beta per income group (3 vals)</w:t>
+            </w:r>
+          </w:p>
+        </w:tc>
+        <w:tc>
+          <w:tcPr>
+            <w:tcW w:type="dxa" w:w="3024"/>
+          </w:tcPr>
+          <w:p>
+            <w:r>
+              <w:t>Same beta per income group, repeated across 16 tracts</w:t>
+            </w:r>
+          </w:p>
+        </w:tc>
+      </w:tr>
+      <w:tr>
+        <w:tc>
+          <w:tcPr>
+            <w:tcW w:type="dxa" w:w="3024"/>
+          </w:tcPr>
+          <w:p>
+            <w:r>
+              <w:t>V_ij matrix shape</w:t>
+            </w:r>
+          </w:p>
+        </w:tc>
+        <w:tc>
+          <w:tcPr>
+            <w:tcW w:type="dxa" w:w="3024"/>
+          </w:tcPr>
+          <w:p>
+            <w:r>
+              <w:t>(3, J)</w:t>
+            </w:r>
+          </w:p>
+        </w:tc>
+        <w:tc>
+          <w:tcPr>
+            <w:tcW w:type="dxa" w:w="3024"/>
+          </w:tcPr>
+          <w:p>
+            <w:r>
+              <w:t>(48, J)</w:t>
+            </w:r>
+          </w:p>
+        </w:tc>
+      </w:tr>
+      <w:tr>
+        <w:tc>
+          <w:tcPr>
+            <w:tcW w:type="dxa" w:w="3024"/>
+          </w:tcPr>
+          <w:p>
+            <w:r>
+              <w:t>logsum vector shape</w:t>
+            </w:r>
+          </w:p>
+        </w:tc>
+        <w:tc>
+          <w:tcPr>
+            <w:tcW w:type="dxa" w:w="3024"/>
+          </w:tcPr>
+          <w:p>
+            <w:r>
+              <w:t>(3,)</w:t>
+            </w:r>
+          </w:p>
+        </w:tc>
+        <w:tc>
+          <w:tcPr>
+            <w:tcW w:type="dxa" w:w="3024"/>
+          </w:tcPr>
+          <w:p>
+            <w:r>
+              <w:t>(48,)</w:t>
+            </w:r>
+          </w:p>
+        </w:tc>
+      </w:tr>
+      <w:tr>
+        <w:tc>
+          <w:tcPr>
+            <w:tcW w:type="dxa" w:w="3024"/>
+          </w:tcPr>
+          <w:p>
+            <w:r>
+              <w:t>DeltaCS formula</w:t>
+            </w:r>
+          </w:p>
+        </w:tc>
+        <w:tc>
+          <w:tcPr>
+            <w:tcW w:type="dxa" w:w="3024"/>
+          </w:tcPr>
+          <w:p>
+            <w:r>
+              <w:t>Sum_{i=1}^{3}  (n_i/beta_p_i)*Dlogsum_i</w:t>
+            </w:r>
+          </w:p>
+        </w:tc>
+        <w:tc>
+          <w:tcPr>
+            <w:tcW w:type="dxa" w:w="3024"/>
+          </w:tcPr>
+          <w:p>
+            <w:r>
+              <w:t>Sum_{i=1}^{48} (n_i/beta_p_i)*Dlogsum_i</w:t>
+            </w:r>
+          </w:p>
+        </w:tc>
+      </w:tr>
+    </w:tbl>
+    <w:p/>
+    <w:p>
+      <w:pPr>
+        <w:ind w:left="432"/>
+        <w:shd w:val="clear" w:color="auto" w:fill="EBF3FB"/>
+      </w:pPr>
+      <w:r>
+        <w:rPr>
+          <w:b/>
+          <w:sz w:val="21"/>
+        </w:rPr>
+        <w:t xml:space="preserve">Note — Why this is worth doing: </w:t>
+      </w:r>
+      <w:r>
+        <w:rPr>
+          <w:sz w:val="21"/>
+        </w:rPr>
+        <w:t>Tracts in Hunts Point vary substantially in their distance to each store. A household in the northern part of CD2 may be 20 minutes from the Peninsula site while one in the south is 5 minutes. Collapsing to a single CD2 centroid underestimates welfare gains for nearby tracts and overestimates them for distant ones. The 48-type model adds spatial precision at negligible computational cost — the formulas are identical, just with 48 rows instead of 3.</w:t>
+      </w:r>
+    </w:p>
+    <w:p>
+      <w:r>
+        <w:t>Data source: ACS 5-Year Table B19001 at the census tract level, filtered to BoroCD = 202. Each tract provides a centroid (Census TIGER) and household counts by income bracket.</w:t>
+      </w:r>
+    </w:p>
+    <w:p/>
+    <w:p>
+      <w:pPr>
+        <w:pStyle w:val="Heading2"/>
+      </w:pPr>
+      <w:r>
+        <w:t>FQ3 — RFP-informed update to pass-through and the subsidy formula</w:t>
+      </w:r>
+    </w:p>
+    <w:p>
+      <w:r>
+        <w:t>The N.Y.C. Groceries RFP fundamentally changes the pass-through model. The current model assumes market-determined pass-through (theta approx 0.65) where the store chooses how much of a cost saving to pass on. The RFP replaces this with a contractually mandated 30%% price reduction on Core Basket items, fully backstopped by NYCEDC.</w:t>
+      </w:r>
+    </w:p>
+    <w:p>
+      <w:pPr>
+        <w:pStyle w:val="Heading3"/>
+      </w:pPr>
+      <w:r>
+        <w:t>Key RFP facts and model implications</w:t>
+      </w:r>
+    </w:p>
+    <w:tbl>
+      <w:tblPr>
+        <w:tblStyle w:val="LightGrid-Accent1"/>
+        <w:tblW w:type="auto" w:w="0"/>
+        <w:tblLook w:firstColumn="1" w:firstRow="1" w:lastColumn="0" w:lastRow="0" w:noHBand="0" w:noVBand="1" w:val="04A0"/>
+      </w:tblPr>
+      <w:tblGrid>
+        <w:gridCol w:w="4536"/>
+        <w:gridCol w:w="4536"/>
+      </w:tblGrid>
+      <w:tr>
+        <w:tc>
+          <w:tcPr>
+            <w:tcW w:type="dxa" w:w="4536"/>
+          </w:tcPr>
+          <w:p>
+            <w:r>
+              <w:rPr>
+                <w:b/>
+              </w:rPr>
+              <w:t>RFP commitment</w:t>
+            </w:r>
+          </w:p>
+        </w:tc>
+        <w:tc>
+          <w:tcPr>
+            <w:tcW w:type="dxa" w:w="4536"/>
+          </w:tcPr>
+          <w:p>
+            <w:r>
+              <w:rPr>
+                <w:b/>
+              </w:rPr>
+              <w:t>Model implication</w:t>
+            </w:r>
+          </w:p>
+        </w:tc>
+      </w:tr>
+      <w:tr>
+        <w:tc>
+          <w:tcPr>
+            <w:tcW w:type="dxa" w:w="4536"/>
+          </w:tcPr>
+          <w:p>
+            <w:r>
+              <w:t>Core Basket prices set at 30%% below retail (monthly reset)</w:t>
+            </w:r>
+          </w:p>
+        </w:tc>
+        <w:tc>
+          <w:tcPr>
+            <w:tcW w:type="dxa" w:w="4536"/>
+          </w:tcPr>
+          <w:p>
+            <w:r>
+              <w:t>Delta_p_core = 0.30 x p_core  (fixed, not market-determined)</w:t>
+            </w:r>
+          </w:p>
+        </w:tc>
+      </w:tr>
+      <w:tr>
+        <w:tc>
+          <w:tcPr>
+            <w:tcW w:type="dxa" w:w="4536"/>
+          </w:tcPr>
+          <w:p>
+            <w:r>
+              <w:t>NYCEDC pays all rent: s_rent = Rent_j</w:t>
+            </w:r>
+          </w:p>
+        </w:tc>
+        <w:tc>
+          <w:tcPr>
+            <w:tcW w:type="dxa" w:w="4536"/>
+          </w:tcPr>
+          <w:p>
+            <w:r>
+              <w:t>Rent subsidy is the primary s component</w:t>
+            </w:r>
+          </w:p>
+        </w:tc>
+      </w:tr>
+      <w:tr>
+        <w:tc>
+          <w:tcPr>
+            <w:tcW w:type="dxa" w:w="4536"/>
+          </w:tcPr>
+          <w:p>
+            <w:r>
+              <w:t>NYCEDC pays all property taxes: s_tax = Tax_j</w:t>
+            </w:r>
+          </w:p>
+        </w:tc>
+        <w:tc>
+          <w:tcPr>
+            <w:tcW w:type="dxa" w:w="4536"/>
+          </w:tcPr>
+          <w:p>
+            <w:r>
+              <w:t>Tax relief is the second s component</w:t>
+            </w:r>
+          </w:p>
+        </w:tc>
+      </w:tr>
+      <w:tr>
+        <w:tc>
+          <w:tcPr>
+            <w:tcW w:type="dxa" w:w="4536"/>
+          </w:tcPr>
+          <w:p>
+            <w:r>
+              <w:t>Affordability Payment covers any remaining gap to reach 30%%</w:t>
+            </w:r>
+          </w:p>
+        </w:tc>
+        <w:tc>
+          <w:tcPr>
+            <w:tcW w:type="dxa" w:w="4536"/>
+          </w:tcPr>
+          <w:p>
+            <w:r>
+              <w:t>theta = 1.0 for Core Basket; NYCEDC absorbs all residual loss</w:t>
+            </w:r>
+          </w:p>
+        </w:tc>
+      </w:tr>
+      <w:tr>
+        <w:tc>
+          <w:tcPr>
+            <w:tcW w:type="dxa" w:w="4536"/>
+          </w:tcPr>
+          <w:p>
+            <w:r>
+              <w:t>Non-Core Basket items priced at typical NYC retail</w:t>
+            </w:r>
+          </w:p>
+        </w:tc>
+        <w:tc>
+          <w:tcPr>
+            <w:tcW w:type="dxa" w:w="4536"/>
+          </w:tcPr>
+          <w:p>
+            <w:r>
+              <w:t>No price reduction for approx 40-60%% of store revenue</w:t>
+            </w:r>
+          </w:p>
+        </w:tc>
+      </w:tr>
+    </w:tbl>
+    <w:p/>
+    <w:p>
+      <w:pPr>
+        <w:pStyle w:val="Heading3"/>
+      </w:pPr>
+      <w:r>
+        <w:t>Revised pass-through formula</w:t>
+      </w:r>
+    </w:p>
+    <w:p>
+      <w:r>
+        <w:t>Replace:  Delta_p_j = theta * s / Q_j  with:</w:t>
+      </w:r>
+    </w:p>
+    <w:p>
+      <w:pPr>
+        <w:ind w:left="504"/>
+        <w:shd w:val="clear" w:color="auto" w:fill="EFEFEF"/>
+      </w:pPr>
+      <w:r>
+        <w:rPr>
+          <w:rFonts w:ascii="Courier New" w:hAnsi="Courier New"/>
+          <w:sz w:val="19"/>
+        </w:rPr>
+        <w:t>Delta_p_j = 0.30 x p_core_j x core_basket_share_j</w:t>
+      </w:r>
+    </w:p>
+    <w:p>
+      <w:r>
+        <w:t>where core_basket_share_j = Core Basket revenue / total revenue approx 40-60%% depending on store type and SKU mix.</w:t>
+      </w:r>
+    </w:p>
+    <w:p>
+      <w:r>
+        <w:t>The required total subsidy to fund this price reduction is:</w:t>
+      </w:r>
+    </w:p>
+    <w:p>
+      <w:pPr>
+        <w:pStyle w:val="Heading2"/>
+      </w:pPr>
+      <w:r>
+        <w:t>FQ2 — Why only SNAP stores? Don't customers also go to the other 137 stores?</w:t>
+      </w:r>
+    </w:p>
+    <w:p>
+      <w:r>
+        <w:t>Customers absolutely go to non-SNAP stores. The SNAP filter is a policy convenience, not an economic necessity.</w:t>
+      </w:r>
+    </w:p>
+    <w:p>
+      <w:pPr>
+        <w:pStyle w:val="Heading3"/>
+      </w:pPr>
+      <w:r>
+        <w:t>Why the model uses only SNAP stores</w:t>
+      </w:r>
+    </w:p>
+    <w:p>
+      <w:r>
+        <w:t>SNAP authorization (USDA SNAP Retailer Locator) is the only filter the model spec justifies — stores must meet federal stocking requirements, making it a rough proxy for 'full-service food store.' But this is not the only or best available source.</w:t>
+      </w:r>
+    </w:p>
+    <w:p>
+      <w:pPr>
+        <w:pStyle w:val="Heading3"/>
+      </w:pPr>
+      <w:r>
+        <w:t>The legitimate problem with this restriction</w:t>
+      </w:r>
+    </w:p>
+    <w:p>
+      <w:r>
+        <w:t>If there are 137 stores in CD2 that residents actually visit, excluding them from the logit choice set violates the assumption that J covers all relevant alternatives:</w:t>
+        <w:br/>
+        <w:t xml:space="preserve">  (1) Biased market shares: excluding stores artificially inflates probabilities for included stores (s_ij sums to 1; denominator is too small).</w:t>
+        <w:br/>
+        <w:t xml:space="preserve">  (2) Overstated welfare gains: the logsum increases more when J is smaller, so excluding real alternatives inflates DeltaCS.</w:t>
+      </w:r>
+    </w:p>
+    <w:p>
+      <w:pPr>
+        <w:pStyle w:val="Heading3"/>
+      </w:pPr>
+      <w:r>
+        <w:t>The 137 stores are already in the project — from NYS Ag &amp; Markets</w:t>
+      </w:r>
+    </w:p>
+    <w:p>
+      <w:r>
+        <w:t>The 137 stores are the NYS Department of Agriculture and Markets (Ag &amp; Markets) 'Retail Food Store' licensed establishments, already downloaded to data/stores/agmarkets_bronx_cd2.csv in Phase 2. Ag &amp; Markets is the preferred primary source because its license category is defined as stores selling food primarily for off-premises consumption. It is not restaurant-inspection data.</w:t>
+      </w:r>
+    </w:p>
+    <w:tbl>
+      <w:tblPr>
+        <w:tblStyle w:val="LightGrid-Accent1"/>
+        <w:tblW w:type="auto" w:w="0"/>
+        <w:tblLook w:firstColumn="1" w:firstRow="1" w:lastColumn="0" w:lastRow="0" w:noHBand="0" w:noVBand="1" w:val="04A0"/>
+      </w:tblPr>
+      <w:tblGrid>
+        <w:gridCol w:w="2880"/>
+        <w:gridCol w:w="2880"/>
+        <w:gridCol w:w="2880"/>
+      </w:tblGrid>
+      <w:tr>
+        <w:tc>
+          <w:tcPr>
+            <w:tcW w:type="dxa" w:w="2880"/>
+          </w:tcPr>
+          <w:p>
+            <w:r>
+              <w:rPr>
+                <w:b/>
+              </w:rPr>
+              <w:t>Source</w:t>
+            </w:r>
+          </w:p>
+        </w:tc>
+        <w:tc>
+          <w:tcPr>
+            <w:tcW w:type="dxa" w:w="2880"/>
+          </w:tcPr>
+          <w:p>
+            <w:r>
+              <w:rPr>
+                <w:b/>
+              </w:rPr>
+              <w:t>CD2 stores found</w:t>
+            </w:r>
+          </w:p>
+        </w:tc>
+        <w:tc>
+          <w:tcPr>
+            <w:tcW w:type="dxa" w:w="2880"/>
+          </w:tcPr>
+          <w:p>
+            <w:r>
+              <w:rPr>
+                <w:b/>
+              </w:rPr>
+              <w:t>Notes</w:t>
+            </w:r>
+          </w:p>
+        </w:tc>
+      </w:tr>
+      <w:tr>
+        <w:tc>
+          <w:tcPr>
+            <w:tcW w:type="dxa" w:w="2880"/>
+          </w:tcPr>
+          <w:p>
+            <w:r>
+              <w:t>NYS Ag &amp; Markets (agmarkets_bronx_cd2.csv)</w:t>
+            </w:r>
+          </w:p>
+        </w:tc>
+        <w:tc>
+          <w:tcPr>
+            <w:tcW w:type="dxa" w:w="2880"/>
+          </w:tcPr>
+          <w:p>
+            <w:r>
+              <w:t>137</w:t>
+            </w:r>
+          </w:p>
+        </w:tc>
+        <w:tc>
+          <w:tcPr>
+            <w:tcW w:type="dxa" w:w="2880"/>
+          </w:tcPr>
+          <w:p>
+            <w:r>
+              <w:t>Retail Food Store license; has square footage; best coverage</w:t>
+            </w:r>
+          </w:p>
+        </w:tc>
+      </w:tr>
+      <w:tr>
+        <w:tc>
+          <w:tcPr>
+            <w:tcW w:type="dxa" w:w="2880"/>
+          </w:tcPr>
+          <w:p>
+            <w:r>
+              <w:t>USDA SNAP Retailer Locator</w:t>
+            </w:r>
+          </w:p>
+        </w:tc>
+        <w:tc>
+          <w:tcPr>
+            <w:tcW w:type="dxa" w:w="2880"/>
+          </w:tcPr>
+          <w:p>
+            <w:r>
+              <w:t>553 raw / ~97 active</w:t>
+            </w:r>
+          </w:p>
+        </w:tc>
+        <w:tc>
+          <w:tcPr>
+            <w:tcW w:type="dxa" w:w="2880"/>
+          </w:tcPr>
+          <w:p>
+            <w:r>
+              <w:t>456 of 553 have an End Date (closed); no square footage</w:t>
+            </w:r>
+          </w:p>
+        </w:tc>
+      </w:tr>
+      <w:tr>
+        <w:tc>
+          <w:tcPr>
+            <w:tcW w:type="dxa" w:w="2880"/>
+          </w:tcPr>
+          <w:p>
+            <w:r>
+              <w:t>NYC DOHMH (Restaurant Inspection Results)</w:t>
+            </w:r>
+          </w:p>
+        </w:tc>
+        <w:tc>
+          <w:tcPr>
+            <w:tcW w:type="dxa" w:w="2880"/>
+          </w:tcPr>
+          <w:p>
+            <w:r>
+              <w:t>9</w:t>
+            </w:r>
+          </w:p>
+        </w:tc>
+        <w:tc>
+          <w:tcPr>
+            <w:tcW w:type="dxa" w:w="2880"/>
+          </w:tcPr>
+          <w:p>
+            <w:r>
+              <w:t>Restaurant/food-service oriented; sparse for grocery retail</w:t>
+            </w:r>
+          </w:p>
+        </w:tc>
+      </w:tr>
+    </w:tbl>
+    <w:p/>
+    <w:p>
+      <w:r>
+        <w:t>The project's Phase 2 report concludes: 'Ag &amp; Markets remains the cleanest licensed retail-food universe for CD2.' DOHMH returned only 9 stores and should be treated as a narrow supplement, not a primary source.</w:t>
+      </w:r>
+    </w:p>
+    <w:p>
+      <w:pPr>
+        <w:ind w:left="432"/>
+        <w:shd w:val="clear" w:color="auto" w:fill="EBF3FB"/>
+      </w:pPr>
+      <w:r>
+        <w:rPr>
+          <w:b/>
+          <w:sz w:val="21"/>
+        </w:rPr>
+        <w:t xml:space="preserve">Note — Caveat — Ag &amp; Markets includes non-consumer-facing entries (Issue #10): </w:t>
+      </w:r>
+      <w:r>
+        <w:rPr>
+          <w:sz w:val="21"/>
+        </w:rPr>
+        <w:t>The raw 137 includes Hunts Point food market operators, wholesalers, and at least one Amazon fulfilment warehouse (PRIME NOW LLC, 180,000 sq ft). Cross-match Ag &amp; Markets + active SNAP + DOHMH on BBL or address and drop warehouses, wholesalers, and manufacturers. Expected clean J: 15-30 consumer-facing food retailers. (Documented in ISSUES_AND_GAPS.md, Issue #10.)</w:t>
+      </w:r>
+    </w:p>
+    <w:p>
+      <w:pPr>
+        <w:pStyle w:val="Heading3"/>
+      </w:pPr>
+      <w:r>
+        <w:t>Recommended source hierarchy for building J</w:t>
+      </w:r>
+    </w:p>
+    <w:p>
+      <w:r>
+        <w:t>(1) Ag &amp; Markets — base universe; filter to consumer-facing retail by sq-ft and name.</w:t>
+        <w:br/>
+        <w:t>(2) SNAP active-only (~97) — secondary check; any store in both Ag &amp; Markets and active SNAP is almost certainly a real grocery store.</w:t>
+        <w:br/>
+        <w:t>(3) DOHMH (9 stores) — narrow supplement to validate the cleaned list; should not drive it.</w:t>
+      </w:r>
+    </w:p>
+    <w:p>
+      <w:pPr>
+        <w:pStyle w:val="Heading3"/>
+      </w:pPr>
+      <w:r>
+        <w:t>In the context of the N.Y.C. Groceries RFP</w:t>
+      </w:r>
+    </w:p>
+    <w:p>
+      <w:r>
+        <w:t>The RFP is for a new purpose-built store at 1215 Spofford Avenue. The RFP notes the area is 'currently served by a single grocery store on Hunts Point Avenue,' suggesting effective competition is already very limited. The cleaned Ag &amp; Markets list will confirm this and quantify the competitive landscape.</w:t>
+      </w:r>
+    </w:p>
+    <w:p/>
+    <w:p>
+      <w:pPr>
+        <w:ind w:left="504"/>
+        <w:shd w:val="clear" w:color="auto" w:fill="EFEFEF"/>
+      </w:pPr>
+      <w:r>
+        <w:rPr>
+          <w:rFonts w:ascii="Courier New" w:hAnsi="Courier New"/>
+          <w:sz w:val="19"/>
+        </w:rPr>
+        <w:t>s_total = max(0,  0.30 x p_core_j x Q_core_j  -  Rent_j  -  Tax_j)  +  AffordabilityPayment_j</w:t>
+      </w:r>
+    </w:p>
+    <w:p>
+      <w:pPr>
+        <w:pStyle w:val="Heading3"/>
+      </w:pPr>
+      <w:r>
+        <w:t>Revised model structure (flip the causal direction)</w:t>
+      </w:r>
+    </w:p>
+    <w:p>
+      <w:r>
+        <w:t>The current model runs forward: s -&gt; Delta_p. Under the RFP, the logic runs backward: the price reduction is fixed at 30%%, and the model should solve for the required s.</w:t>
+      </w:r>
+    </w:p>
+    <w:p>
+      <w:pPr>
+        <w:ind w:left="504"/>
+        <w:shd w:val="clear" w:color="auto" w:fill="EFEFEF"/>
+      </w:pPr>
+      <w:r>
+        <w:rPr>
+          <w:rFonts w:ascii="Courier New" w:hAnsi="Courier New"/>
+          <w:sz w:val="19"/>
+        </w:rPr>
+        <w:t>Goal 1 revised: find s* = 0.30 x p_core x Q_core - Rent_j - Tax_j</w:t>
+        <w:br/>
+        <w:t>Goal 2 revised: which store minimizes s* for a given DeltaCS threshold?</w:t>
+      </w:r>
+    </w:p>
+    <w:p>
+      <w:pPr>
+        <w:ind w:left="432"/>
+        <w:shd w:val="clear" w:color="auto" w:fill="EBF3FB"/>
+      </w:pPr>
+      <w:r>
+        <w:rPr>
+          <w:b/>
+          <w:sz w:val="21"/>
+        </w:rPr>
+        <w:t xml:space="preserve">Note — What theta becomes in the RFP context: </w:t>
+      </w:r>
+      <w:r>
+        <w:rPr>
+          <w:sz w:val="21"/>
+        </w:rPr>
+        <w:t>Under the RFP, the effective pass-through for Core Basket items is theta = 1.0 (NYCEDC guarantees full pass-through via Affordability Payments). For non-Core Basket items, theta = 0 (operator prices at market). The effective whole-store theta is therefore: theta_effective = 1.0 x core_basket_share + 0 x (1 - core_basket_share) = core_basket_share approx 0.40-0.60. This is lower than the model's assumed 0.65 for stores where non-core items dominate sales.</w:t>
+      </w:r>
+    </w:p>
+    <w:p>
+      <w:r>
+        <w:t>Sources (RFP):</w:t>
+        <w:br/>
+        <w:t xml:space="preserve">  - RFP p. 12 (Core Basket 30%% discount mandate)</w:t>
+        <w:br/>
+        <w:t xml:space="preserve">  - RFP p. 7 (rent + property tax fully covered)</w:t>
+        <w:br/>
+        <w:t xml:space="preserve">  - RFP Q&amp;A #2, #4, #9 (Affordability Payments cover gap to 30%%)</w:t>
+        <w:br/>
+        <w:t xml:space="preserve">  - RFP Appendix E (Affordability Payment Estimate Assumptions Table)</w:t>
+      </w:r>
+    </w:p>
+    <w:p/>
+    <w:p>
+      <w:pPr>
+        <w:pStyle w:val="Heading2"/>
+      </w:pPr>
+      <w:r>
+        <w:t>FQ4 — Is beta_p_i price sensitivity or marginal utility of income? What is gamma?</w:t>
+      </w:r>
+    </w:p>
+    <w:p>
+      <w:pPr>
+        <w:pStyle w:val="Heading3"/>
+      </w:pPr>
+      <w:r>
+        <w:t>beta_p_i — both characterizations are correct</w:t>
+      </w:r>
+    </w:p>
+    <w:p>
+      <w:r>
+        <w:t>In the demand equation (Eq 1.1.1a): beta_p_i is the rate at which utility falls per additional dollar of basket price. This is precisely 'price sensitivity' — a higher beta_p means a $1 price increase hurts more.</w:t>
+      </w:r>
+    </w:p>
+    <w:p>
+      <w:r>
+        <w:t>In the welfare formula (Eq 1.1.5a-c): the same beta_p_i appears in the denominator 1/beta_p_i, which converts utility units to dollars. This is the role of the marginal utility of income (lambda in standard consumer theory).</w:t>
+      </w:r>
+    </w:p>
+    <w:p>
+      <w:r>
+        <w:t>The two are the same number because of Roy's Identity: in a model where the consumer maximizes utility subject to a budget constraint, the marginal utility of an additional dollar of income equals the marginal utility of a one-dollar price reduction. In the linear utility model here, that marginal utility of income IS beta_p_i.</w:t>
+      </w:r>
+    </w:p>
+    <w:p>
+      <w:pPr>
+        <w:ind w:left="504"/>
+        <w:shd w:val="clear" w:color="auto" w:fill="EFEFEF"/>
+      </w:pPr>
+      <w:r>
+        <w:rPr>
+          <w:rFonts w:ascii="Courier New" w:hAnsi="Courier New"/>
+          <w:sz w:val="19"/>
+        </w:rPr>
+        <w:t>Roy's Identity:  dV/d(income) = beta_p_i  (same coefficient as dV/d(price), opposite sign)</w:t>
+        <w:br/>
+        <w:t>=&gt; 1 dollar of income gain ~ 1 dollar of price reduction in utility impact</w:t>
+        <w:br/>
+        <w:t>=&gt; 1 util = 1/beta_p_i dollars</w:t>
+      </w:r>
+    </w:p>
+    <w:p>
+      <w:r>
+        <w:t>Practical consequence: a low-income household with beta_p_i = 0.55 values each util at $1/0.55 = $1.82. A high-income household with beta_p_i = 0.15 values each util at $1/0.15 = $6.67. This means the logsum formula attributes more dollar value to the same utility gain for high-income households — one reason the spec tracks the 'pct_low' metric.</w:t>
+      </w:r>
+    </w:p>
+    <w:p>
+      <w:pPr>
+        <w:ind w:left="432"/>
+        <w:shd w:val="clear" w:color="auto" w:fill="EBF3FB"/>
+      </w:pPr>
+      <w:r>
+        <w:rPr>
+          <w:b/>
+          <w:sz w:val="21"/>
+        </w:rPr>
+        <w:t xml:space="preserve">Note — Why both descriptions appear in the document: </w:t>
+      </w:r>
+      <w:r>
+        <w:rPr>
+          <w:sz w:val="21"/>
+        </w:rPr>
+        <w:t>The spec correctly calls beta_p_i a 'price sensitivity parameter' in the demand section (Section 1.1.2) and uses 1/beta_p_i as a dollar converter in the welfare section (Section 1.1.5). These are two sides of the same coin: beta_p_i = MU_income in this model class. Train (2009) Ch. 3 Section 3.1 discusses this equivalence directly.</w:t>
+      </w:r>
+    </w:p>
+    <w:p>
+      <w:pPr>
+        <w:pStyle w:val="Heading3"/>
+      </w:pPr>
+      <w:r>
+        <w:t>What is gamma?</w:t>
+      </w:r>
+    </w:p>
+    <w:p>
+      <w:r>
+        <w:t>gamma approx 0.5772 is the Euler-Mascheroni constant, defined as:</w:t>
+      </w:r>
+    </w:p>
+    <w:p>
+      <w:pPr>
+        <w:ind w:left="504"/>
+        <w:shd w:val="clear" w:color="auto" w:fill="EFEFEF"/>
+      </w:pPr>
+      <w:r>
+        <w:rPr>
+          <w:rFonts w:ascii="Courier New" w:hAnsi="Courier New"/>
+          <w:sz w:val="19"/>
+        </w:rPr>
+        <w:t>gamma = lim_{n-&gt;inf} (1 + 1/2 + 1/3 + ... + 1/n - ln n)</w:t>
+      </w:r>
+    </w:p>
+    <w:p>
+      <w:r>
+        <w:t>In the welfare context it arises because the expected value of the maximum of Gumbel(0,1) random variables is exactly gamma:</w:t>
+      </w:r>
+    </w:p>
+    <w:p>
+      <w:pPr>
+        <w:ind w:left="504"/>
+        <w:shd w:val="clear" w:color="auto" w:fill="EFEFEF"/>
+      </w:pPr>
+      <w:r>
+        <w:rPr>
+          <w:rFonts w:ascii="Courier New" w:hAnsi="Courier New"/>
+          <w:sz w:val="19"/>
+        </w:rPr>
+        <w:t>E[max_j epsilon_ij] = gamma    (when all epsilon_ij are i.i.d. Gumbel(0,1))</w:t>
+      </w:r>
+    </w:p>
+    <w:p>
+      <w:r>
+        <w:t>Intuitive interpretation: Even when all stores have identical systematic utility (V_ij = 0 for all j), the consumer still gets some positive expected utility — because they pick the best random draw epsilon_ij from the Gumbel distribution. gamma is the average value of that 'best random draw' bonus — the expected option value of having a choice set at all.</w:t>
+      </w:r>
+    </w:p>
+    <w:p>
+      <w:r>
+        <w:t>Why it doesn't matter in practice: gamma appears identically in both W_i_pre and W_i_post (since the choice set J is the same before and after the subsidy). It cancels exactly in Delta_W_i = W_i_post - W_i_pre, so it never needs to be computed. This is why the spec can write DeltaCS without ever mentioning gamma.</w:t>
+      </w:r>
+    </w:p>
+    <w:p>
+      <w:r>
+        <w:t>Sources:</w:t>
+        <w:br/>
+        <w:t xml:space="preserve">  - Train (2009), Ch. 2 Appendix, Theorem 2.1 — proof that E[max_j epsilon_ij] = gamma.</w:t>
+        <w:br/>
+        <w:t xml:space="preserve">    https://eml.berkeley.edu/books/train1201.pdf</w:t>
+        <w:br/>
+        <w:t xml:space="preserve">  - Small &amp; Rosen (1981), p. 108 — notes that gamma cancels in welfare differences.</w:t>
+        <w:br/>
+        <w:t xml:space="preserve">    https://www.jstor.org/stable/1911129</w:t>
+      </w:r>
+    </w:p>
     <w:sectPr>
       <w:pgSz w:w="12240" w:h="15840"/>
       <w:pgMar w:top="1440" w:right="1584" w:bottom="1440" w:left="1584" w:header="720" w:footer="720" w:gutter="0"/>

</xml_diff>